<commit_message>
Update Product Specification & User Manual (.docx) with all 13 core modules including Inventory Reserving, Legal Document Generation, Cloud File Storage, and Inspections
</commit_message>
<xml_diff>
--- a/NAW_Property_Flow_CRM_RICAF_Product_Guide.docx
+++ b/NAW_Property_Flow_CRM_RICAF_Product_Guide.docx
@@ -16,12 +16,12 @@
         <w:tc>
           <w:tcPr>
             <w:tcW w:type="dxa" w:w="9936"/>
-            <w:shd w:fill="0F172A"/>
+            <w:shd w:fill="0B132B"/>
             <w:tcMar>
-              <w:top w:w="280" w:type="dxa"/>
-              <w:bottom w:w="280" w:type="dxa"/>
-              <w:left w:w="280" w:type="dxa"/>
-              <w:right w:w="280" w:type="dxa"/>
+              <w:top w:w="300" w:type="dxa"/>
+              <w:bottom w:w="300" w:type="dxa"/>
+              <w:left w:w="300" w:type="dxa"/>
+              <w:right w:w="300" w:type="dxa"/>
             </w:tcMar>
           </w:tcPr>
           <w:p>
@@ -41,9 +41,9 @@
             <w:r>
               <w:rPr>
                 <w:color w:val="94A3B8"/>
-                <w:sz w:val="18"/>
+                <w:sz w:val="19"/>
               </w:rPr>
-              <w:t>Product Division: NAW Property Flow CRM</w:t>
+              <w:t>Enterprise Division: NAW Property Flow CRM</w:t>
             </w:r>
           </w:p>
           <w:p>
@@ -51,9 +51,9 @@
               <w:rPr>
                 <w:b/>
                 <w:color w:val="FFFFFF"/>
-                <w:sz w:val="36"/>
+                <w:sz w:val="34"/>
               </w:rPr>
-              <w:t>ENTERPRISE CRM PRODUCT SPECIFICATION &amp; USER MANUAL</w:t>
+              <w:t>COMPLETE PRODUCT ARCHITECTURE, MODULE DIRECTORY &amp; OPERATIONAL MANUAL</w:t>
             </w:r>
           </w:p>
           <w:p>
@@ -82,17 +82,12 @@
         <w:rPr>
           <w:color w:val="0F172A"/>
         </w:rPr>
-        <w:t>1. Executive Overview</w:t>
+        <w:t>1. Executive Overview &amp; Mission</w:t>
       </w:r>
     </w:p>
     <w:p>
       <w:r>
-        <w:t>NAW Property Flow CRM is an enterprise-grade real estate automation and sales pipeline solution developed by NAW World Technologies Limited for RICAF Nigeria Limited. It eliminates manual bottlenecks across lead prospecting, part-payment milestone tracking, automated PDF receipt dispatching, verified marketer commission payouts, staff performance evaluation, and diaspora client engagement.</w:t>
-      </w:r>
-    </w:p>
-    <w:p>
-      <w:r>
-        <w:t>The system is built on a multi-tenant cloud architecture ensuring total data sovereignty, bank-grade cryptographic authentication, and real-time financial transparency across all branch locations.</w:t>
+        <w:t>NAW Property Flow CRM is a state-of-the-art, multi-tenant enterprise real estate operating system engineered by NAW World Technologies Limited specifically for the sales, development, and administrative operations of RICAF Nigeria Limited. It unifies every dimension of real estate commerce—from raw digital lead acquisition and estate unit inventory reserving, to part-payment installment calculations, instant stamped PDF receipting, admin payment verification safeguards, automated marketer payroll commissions, and 1-tap client portal experiences.</w:t>
       </w:r>
     </w:p>
     <w:p>
@@ -103,12 +98,12 @@
         <w:rPr>
           <w:color w:val="0F172A"/>
         </w:rPr>
-        <w:t>2. Role-Based Permissions &amp; User Workflows</w:t>
+        <w:t>2. Role-Based Security Matrix &amp; Organizational Workflows</w:t>
       </w:r>
     </w:p>
     <w:p>
       <w:r>
-        <w:t>To safeguard sensitive corporate financial records while empowering sales personnel in the field, NAW Property Flow CRM enforces strict Role-Based Access Control (RBAC):</w:t>
+        <w:t>To ensure total commercial confidentiality while empowering field sales agents, the CRM enforces rigorous role segregation:</w:t>
       </w:r>
     </w:p>
     <w:tbl>
@@ -142,7 +137,7 @@
                 <w:color w:val="FFFFFF"/>
                 <w:sz w:val="19"/>
               </w:rPr>
-              <w:t>User Role</w:t>
+              <w:t>Role Identifier</w:t>
             </w:r>
           </w:p>
         </w:tc>
@@ -164,7 +159,7 @@
                 <w:color w:val="FFFFFF"/>
                 <w:sz w:val="19"/>
               </w:rPr>
-              <w:t>Operational Scope</w:t>
+              <w:t>Access Scope</w:t>
             </w:r>
           </w:p>
         </w:tc>
@@ -186,7 +181,7 @@
                 <w:color w:val="FFFFFF"/>
                 <w:sz w:val="19"/>
               </w:rPr>
-              <w:t>Key Responsibilities &amp; Protections</w:t>
+              <w:t>Core Responsibilities &amp; Safeguards</w:t>
             </w:r>
           </w:p>
         </w:tc>
@@ -213,7 +208,7 @@
                 <w:color w:val="0F172A"/>
                 <w:sz w:val="18"/>
               </w:rPr>
-              <w:t>Super Admin / Company Admin</w:t>
+              <w:t>Super Admin &amp; Company Admin</w:t>
             </w:r>
           </w:p>
         </w:tc>
@@ -236,7 +231,7 @@
               <w:rPr>
                 <w:sz w:val="18"/>
               </w:rPr>
-              <w:t>Full Enterprise Visibility (Company-Wide &amp; All Branches)</w:t>
+              <w:t>Company-Wide &amp; Multi-Branch</w:t>
             </w:r>
           </w:p>
         </w:tc>
@@ -259,13 +254,13 @@
               <w:rPr>
                 <w:sz w:val="18"/>
               </w:rPr>
-              <w:t>• Access full company revenues, financial charts, and audit logs.</w:t>
+              <w:t>• Absolute visibility over all company revenues, financial charts, and audit logs.</w:t>
               <w:br/>
-              <w:t>• Sole authority to 'Verify Milestone Payments' before marketer commissions are disbursed.</w:t>
+              <w:t>• Sole authorized sign-off on Payment Verifications before commissions disburse.</w:t>
               <w:br/>
-              <w:t>• Execute monthly automated payroll and approve staff leaves.</w:t>
+              <w:t>• 1-Click Monthly Payroll approval and automated bank payment schedule export.</w:t>
               <w:br/>
-              <w:t>• Manage estates, properties, unit inventories, and marketing campaigns.</w:t>
+              <w:t>• System settings, branch creation, user permissions, and legal template configuration.</w:t>
             </w:r>
           </w:p>
         </w:tc>
@@ -315,7 +310,7 @@
               <w:rPr>
                 <w:sz w:val="18"/>
               </w:rPr>
-              <w:t>Branch &amp; Team Supervision</w:t>
+              <w:t>Branch &amp; Team Leadership</w:t>
             </w:r>
           </w:p>
         </w:tc>
@@ -338,13 +333,13 @@
               <w:rPr>
                 <w:sz w:val="18"/>
               </w:rPr>
-              <w:t>• Monitor all branch leads and conversion rates on the live Kanban board.</w:t>
+              <w:t>• Real-time visibility across branch leads on visual Kanban &amp; Table pipelines.</w:t>
               <w:br/>
-              <w:t>• Assign and reallocate inbound leads to active sales executives.</w:t>
+              <w:t>• Managerial authority to assign and reallocate leads among active sales agents.</w:t>
               <w:br/>
-              <w:t>• Track sales targets and evaluate monthly branch revenue goals.</w:t>
+              <w:t>• Schedule and approve site inspections and track branch monthly sales quotas.</w:t>
               <w:br/>
-              <w:t>• Schedule and approve site inspections.</w:t>
+              <w:t>• Monitor agent conversion metrics and lead follow-up compliance.</w:t>
             </w:r>
           </w:p>
         </w:tc>
@@ -394,7 +389,7 @@
               <w:rPr>
                 <w:sz w:val="18"/>
               </w:rPr>
-              <w:t>Personal Leads &amp; Personal Commissions</w:t>
+              <w:t>Personal Pipeline &amp; Personal Earnings</w:t>
             </w:r>
           </w:p>
         </w:tc>
@@ -417,13 +412,13 @@
               <w:rPr>
                 <w:sz w:val="18"/>
               </w:rPr>
-              <w:t>• Automatic Lead Ownership: Any lead created or bulk CSV uploaded is permanently locked to their name.</w:t>
+              <w:t>• Guaranteed Lead Ownership: All leads created or imported via CSV are locked to their user ID.</w:t>
               <w:br/>
-              <w:t>• Privacy Safeguard: Marketers ONLY see their assigned leads; other agents' prospects and company payroll records are completely hidden.</w:t>
+              <w:t>• Data Privacy: Only their assigned prospects are visible; other agents' contacts and company payroll financials are hidden.</w:t>
               <w:br/>
-              <w:t>• Real-time commission tracking on their personal dashboard.</w:t>
+              <w:t>• Real-time commission earnings tracking on their personalized dashboard card.</w:t>
               <w:br/>
-              <w:t>• 1-Click WhatsApp &amp; Email Client Portal sharing.</w:t>
+              <w:t>• 1-Click WhatsApp Client Portal sharing with buyers.</w:t>
             </w:r>
           </w:p>
         </w:tc>
@@ -473,7 +468,7 @@
               <w:rPr>
                 <w:sz w:val="18"/>
               </w:rPr>
-              <w:t>Staff Onboarding, Performance &amp; Salaries</w:t>
+              <w:t>Staff Governance, Appraisals &amp; Payroll</w:t>
             </w:r>
           </w:p>
         </w:tc>
@@ -496,11 +491,11 @@
               <w:rPr>
                 <w:sz w:val="18"/>
               </w:rPr>
-              <w:t>• Track staff leaderboard rankings, lead-to-deal conversion ratios, and targets.</w:t>
+              <w:t>• Track company-wide staff leaderboard rankings, sales volumes, and revenue.</w:t>
               <w:br/>
-              <w:t>• 1-Click Monthly Payroll Generation: Automatically pulls base salary and verified marketer commissions into approved payslips.</w:t>
+              <w:t>• Automated Monthly Payroll Run: Aggregates base salaries + approved marketer commissions.</w:t>
               <w:br/>
-              <w:t>• Manage staff attendance, leave applications, and onboarding checklists.</w:t>
+              <w:t>• Manage employee leave applications, staff submissions, certifications, and onboarding.</w:t>
             </w:r>
           </w:p>
         </w:tc>
@@ -573,13 +568,13 @@
               <w:rPr>
                 <w:sz w:val="18"/>
               </w:rPr>
-              <w:t>• 1-Tap Secure Magic Link Access: No passwords to remember; instant login from WhatsApp/Email.</w:t>
+              <w:t>• 1-Tap Magic Link Access: Instant zero-password login from WhatsApp or Email.</w:t>
               <w:br/>
-              <w:t>• Real-time payment statement (Amount Paid vs Outstanding Balance).</w:t>
+              <w:t>• Financial Statement: Real-time tracking of Amount Paid vs Outstanding Balance.</w:t>
               <w:br/>
-              <w:t>• Download official PDF receipts stamped with corporate seal.</w:t>
+              <w:t>• Download stamped PDF receipts (REC-XXXXXX) and Allocation/Contract documents.</w:t>
               <w:br/>
-              <w:t>• View estate construction milestone photos and unit allocations.</w:t>
+              <w:t>• Real-time inspection of estate development milestones and progress photos.</w:t>
             </w:r>
           </w:p>
         </w:tc>
@@ -598,7 +593,7 @@
         <w:rPr>
           <w:color w:val="0F172A"/>
         </w:rPr>
-        <w:t>3. Detailed Core Modules &amp; Workflows</w:t>
+        <w:t>3. Exhaustive Core Feature Directory</w:t>
       </w:r>
     </w:p>
     <w:p>
@@ -608,9 +603,9 @@
       <w:r>
         <w:rPr>
           <w:color w:val="FEA500"/>
-          <w:sz w:val="24"/>
+          <w:sz w:val="23"/>
         </w:rPr>
-        <w:t>A. Lead Pipeline &amp; Auto-Assignment Engine</w:t>
+        <w:t>1. Lead Capture, Auto-Assignment &amp; Drag-and-Drop Pipeline</w:t>
       </w:r>
     </w:p>
     <w:p>
@@ -618,13 +613,13 @@
         <w:spacing w:line="288" w:lineRule="auto" w:after="160"/>
       </w:pPr>
       <w:r>
-        <w:t>• Quick Capture &amp; CSV Import: Supports single-lead entry and bulk spreadsheet imports.</w:t>
+        <w:t>• Single &amp; Bulk CSV Ingestion: Quick creation and spreadsheet upload with sample templates.</w:t>
         <w:br/>
-        <w:t>• Auto-Assignment Safeguard: When a Sales Executive inputs leads, the CRM automatically assigns them to that officer. Reassignment by unauthorized parties is strictly blocked.</w:t>
+        <w:t>• Locked Marketer Ownership: Automatic assignment protection preventing unauthorized reallocation.</w:t>
         <w:br/>
-        <w:t>• Visual Drag-and-Drop Kanban Board: Move prospects from 'New' -&gt; 'Contacted' -&gt; 'Follow-Up' -&gt; 'Inspection Scheduled' -&gt; 'Negotiation' -&gt; 'Payment Processing' -&gt; 'Closed Won'.</w:t>
+        <w:t>• Dual-View Pipeline: Seamless switching between Table and visual Drag-and-Drop Kanban boards.</w:t>
         <w:br/>
-        <w:t>• Executive Counters: Real-time top cards display Total Pipeline, New Prospects, Tours in Flight, and Conversion Rate %.</w:t>
+        <w:t>• Executive Top Counters: Real-time overview of Total Pipeline, New Prospects, Tours in Flight, and Conversion Rate %.</w:t>
       </w:r>
     </w:p>
     <w:p>
@@ -634,9 +629,9 @@
       <w:r>
         <w:rPr>
           <w:color w:val="FEA500"/>
-          <w:sz w:val="24"/>
+          <w:sz w:val="23"/>
         </w:rPr>
-        <w:t>B. Flexible Part-Payment &amp; Dynamic Installment Engine</w:t>
+        <w:t>2. Estate, Plot &amp; Unit Inventory Engine</w:t>
       </w:r>
     </w:p>
     <w:p>
@@ -644,11 +639,13 @@
         <w:spacing w:line="288" w:lineRule="auto" w:after="160"/>
       </w:pPr>
       <w:r>
-        <w:t>• Outright vs Spread Plans: Toggle between 100% Outright and Part-Payment plans.</w:t>
+        <w:t>• Master Estates &amp; Projects: Categorize properties by Estate Name, Property Type (Land, Duplex, Terrace), Price, and Location.</w:t>
         <w:br/>
-        <w:t>• Live Installment Calculator: Set deposit amount and spread duration (3 to 24 months). The system auto-calculates the remaining balance and generates exact monthly payment tranches.</w:t>
+        <w:t>• Unit-Level Inventory: Track specific plot and unit numbers (e.g. Plot 12, Block B).</w:t>
         <w:br/>
-        <w:t>• Milestone Scheduling: Milestone 1 (Deposit) is receipted immediately, while future tranches automatically schedule reminder due dates.</w:t>
+        <w:t>• Interactive Unit Lifecycle: Unit status transitions seamlessly between 'Available' -&gt; 'Reserved' -&gt; 'Sold / Converted'.</w:t>
+        <w:br/>
+        <w:t>• Bulk Unit Generator: 1-click batch generation of plots/units across entire phases.</w:t>
       </w:r>
     </w:p>
     <w:p>
@@ -658,9 +655,9 @@
       <w:r>
         <w:rPr>
           <w:color w:val="FEA500"/>
-          <w:sz w:val="24"/>
+          <w:sz w:val="23"/>
         </w:rPr>
-        <w:t>C. Instant Stamped PDF Receipt Generation &amp; Email Dispatch</w:t>
+        <w:t>3. Inspections &amp; Follow-Up Compliance Tracking</w:t>
       </w:r>
     </w:p>
     <w:p>
@@ -668,11 +665,13 @@
         <w:spacing w:line="288" w:lineRule="auto" w:after="160"/>
       </w:pPr>
       <w:r>
-        <w:t>• Automated Document Engine: The moment a deposit or milestone payment is logged, a high-resolution, branded PDF Receipt (REC-XXXXXX) is generated.</w:t>
+        <w:t>• Booking Calendar: Schedule physical or virtual site inspections with clients.</w:t>
         <w:br/>
-        <w:t>• Corporate Stamping: Features official RICAF verification stamps, bank transaction reference, amount paid in words, outstanding balance, and estate allocation.</w:t>
+        <w:t>• Officer Assignment: Assign inspection chaperones and log feedback notes.</w:t>
         <w:br/>
-        <w:t>• Direct Email Dispatch: Automatically attaches the receipt PDF and delivers it to the investor's inbox.</w:t>
+        <w:t>• Structured Follow-Ups: Schedule Call, WhatsApp, Email, or Meeting follow-ups with automatic overdue reminders.</w:t>
+        <w:br/>
+        <w:t>• Timeline Audit: Every client touchpoint is permanently recorded on their activity log.</w:t>
       </w:r>
     </w:p>
     <w:p>
@@ -682,9 +681,9 @@
       <w:r>
         <w:rPr>
           <w:color w:val="FEA500"/>
-          <w:sz w:val="24"/>
+          <w:sz w:val="23"/>
         </w:rPr>
-        <w:t>D. Payment Verification Safeguards &amp; Automated Commission Queuing</w:t>
+        <w:t>4. Dynamic Part-Payment, Installment Calculator &amp; Milestone Engine</w:t>
       </w:r>
     </w:p>
     <w:p>
@@ -692,11 +691,11 @@
         <w:spacing w:line="288" w:lineRule="auto" w:after="160"/>
       </w:pPr>
       <w:r>
-        <w:t>• Audit Separation: Recorded milestone payments enter a 'Pending Audit' status.</w:t>
+        <w:t>• Flexible Payment Structures: Toggle between 100% Outright and Part-Payment plans.</w:t>
         <w:br/>
-        <w:t>• Admin-Only Verification: Only Company Admins or Super Admins can verify funds.</w:t>
+        <w:t>• Live Installment Calculator: Instant calculation of Deposit Paid, Spread Duration (3–24 Months), Remaining Balance, and Monthly Tranches.</w:t>
         <w:br/>
-        <w:t>• Automated Commission Approval: Upon verification, the marketer's commission rate is calculated and moved to 'Approved' status, automatically queuing it for the upcoming monthly payroll.</w:t>
+        <w:t>• Automated Milestone Scheduling: Milestone 1 (Deposit) is receipted immediately while future tranches automatically schedule reminder due dates.</w:t>
       </w:r>
     </w:p>
     <w:p>
@@ -706,9 +705,9 @@
       <w:r>
         <w:rPr>
           <w:color w:val="FEA500"/>
-          <w:sz w:val="24"/>
+          <w:sz w:val="23"/>
         </w:rPr>
-        <w:t>E. 1-Tap Client Portal Magic Link &amp; WhatsApp Sharing</w:t>
+        <w:t>5. Instant Stamped PDF Receipt Generation &amp; Email Dispatch</w:t>
       </w:r>
     </w:p>
     <w:p>
@@ -716,11 +715,11 @@
         <w:spacing w:line="288" w:lineRule="auto" w:after="160"/>
       </w:pPr>
       <w:r>
-        <w:t>• Zero Password Frustration: Marketers can click 'Share on WhatsApp' directly from the client's file.</w:t>
+        <w:t>• Automated Document Generation: Immediate generation of official PDF receipts (REC-XXXXXX) upon payment entry.</w:t>
         <w:br/>
-        <w:t>• 64-Hex Cryptographic Token: Generates an ultra-secure 1-tap link that instantly logs the buyer into their private dashboard.</w:t>
+        <w:t>• Corporate Stamping: Features official RICAF verification stamps, bank transaction reference, amount paid in words, outstanding balance, and estate allocation.</w:t>
         <w:br/>
-        <w:t>• Real-time Tracking: Clients inspect construction milestone meters, estate photos, payment history, and download contract documents on their mobile phones 24/7.</w:t>
+        <w:t>• Automated Outgoing Email Delivery: Directly dispatches stamped PDF receipts to the investor's inbox via authenticated SMTP.</w:t>
       </w:r>
     </w:p>
     <w:p>
@@ -730,9 +729,9 @@
       <w:r>
         <w:rPr>
           <w:color w:val="FEA500"/>
-          <w:sz w:val="24"/>
+          <w:sz w:val="23"/>
         </w:rPr>
-        <w:t>F. Newsletter &amp; Targeted Email Marketing Campaigns</w:t>
+        <w:t>6. Payment Verification Safeguards &amp; Automated Commission Queuing</w:t>
       </w:r>
     </w:p>
     <w:p>
@@ -740,11 +739,11 @@
         <w:spacing w:line="288" w:lineRule="auto" w:after="160"/>
       </w:pPr>
       <w:r>
-        <w:t>• Dynamic Audience Segmentation: Filter audiences by Lead Status (e.g., Hot Follow-Ups, Diaspora Prospects) or Property Interest.</w:t>
+        <w:t>• Two-Tier Financial Audit: Payments enter as 'Pending Audit' until confirmed by Admin.</w:t>
         <w:br/>
-        <w:t>• Rich Visual Builder: Clean HTML newsletters with real-time audience recipient counters.</w:t>
+        <w:t>• Admin Sign-Off: Only Company Admins or Super Admins can verify payments.</w:t>
         <w:br/>
-        <w:t>• Open &amp; Click Tracking: Full analytics on subscriber interaction.</w:t>
+        <w:t>• Automated Marketer Commission: Recalculates verified funds, records verifier timestamp, and queues commission with status 'Approved' for monthly payroll.</w:t>
       </w:r>
     </w:p>
     <w:p>
@@ -754,9 +753,81 @@
       <w:r>
         <w:rPr>
           <w:color w:val="FEA500"/>
-          <w:sz w:val="24"/>
+          <w:sz w:val="23"/>
         </w:rPr>
-        <w:t>G. HR Management, Leaderboards &amp; 1-Click Monthly Payroll</w:t>
+        <w:t>7. 1-Tap Client Portal Magic Link &amp; WhatsApp Sharing</w:t>
+      </w:r>
+    </w:p>
+    <w:p>
+      <w:pPr>
+        <w:spacing w:line="288" w:lineRule="auto" w:after="160"/>
+      </w:pPr>
+      <w:r>
+        <w:t>• 0-Friction Mobile Access: Marketers share a 1-tap WhatsApp or Email link directly from the client profile.</w:t>
+        <w:br/>
+        <w:t>• 256-Bit Cryptographic Token: 64-hex random security token provides instant password-free access.</w:t>
+        <w:br/>
+        <w:t>• Live Client Portfolio: Investors view payment statements, download receipts, and inspect estate construction progress 24/7.</w:t>
+      </w:r>
+    </w:p>
+    <w:p>
+      <w:pPr>
+        <w:pStyle w:val="Heading2"/>
+      </w:pPr>
+      <w:r>
+        <w:rPr>
+          <w:color w:val="FEA500"/>
+          <w:sz w:val="23"/>
+        </w:rPr>
+        <w:t>8. Legal Document Generation &amp; Contract Automation</w:t>
+      </w:r>
+    </w:p>
+    <w:p>
+      <w:pPr>
+        <w:spacing w:line="288" w:lineRule="auto" w:after="160"/>
+      </w:pPr>
+      <w:r>
+        <w:t>• Dynamic Variable Templates: Build Deed of Contract, Provisional Allocation Letters, and Receipts using merge tags like {{buyer_name}}, {{property_name}}, and {{amount_paid}}.</w:t>
+        <w:br/>
+        <w:t>• 1-Click PDF Generation: Instant compiling of legal contracts ready for digital download and email delivery.</w:t>
+      </w:r>
+    </w:p>
+    <w:p>
+      <w:pPr>
+        <w:pStyle w:val="Heading2"/>
+      </w:pPr>
+      <w:r>
+        <w:rPr>
+          <w:color w:val="FEA500"/>
+          <w:sz w:val="23"/>
+        </w:rPr>
+        <w:t>9. Targeted Newsletter Campaigns &amp; Marketing Drip Sequences</w:t>
+      </w:r>
+    </w:p>
+    <w:p>
+      <w:pPr>
+        <w:spacing w:line="288" w:lineRule="auto" w:after="160"/>
+      </w:pPr>
+      <w:r>
+        <w:t>• Audience Segmentation: Filter recipients by Lead Status (e.g. Hot Prospects) or Property Interest.</w:t>
+        <w:br/>
+        <w:t>• Rich Visual Builder: Clean HTML newsletters with real-time recipient counts.</w:t>
+        <w:br/>
+        <w:t>• Automated Drip Sequences: Trigger automated email sequences based on prospect lifecycle stages.</w:t>
+        <w:br/>
+        <w:t>• Open &amp; Click Analytics: Full tracking on email engagement.</w:t>
+      </w:r>
+    </w:p>
+    <w:p>
+      <w:pPr>
+        <w:pStyle w:val="Heading2"/>
+      </w:pPr>
+      <w:r>
+        <w:rPr>
+          <w:color w:val="FEA500"/>
+          <w:sz w:val="23"/>
+        </w:rPr>
+        <w:t>10. HR Management, Sales Leaderboard &amp; 1-Click Automated Payroll</w:t>
       </w:r>
     </w:p>
     <w:p>
@@ -766,7 +837,75 @@
       <w:r>
         <w:t>• Gamified Sales Leaderboard: Live monthly rankings highlighting Gold, Silver, and Bronze sales champions, revenue totals, and conversion rates.</w:t>
         <w:br/>
-        <w:t>• Automated Payroll Run: Aggregates base staff salaries + verified monthly commissions into consolidated payslips ready for 1-click PDF download.</w:t>
+        <w:t>• Departmental Target Tracking: Set revenue and unit quotas per department.</w:t>
+        <w:br/>
+        <w:t>• 1-Click Automated Monthly Payroll: Automatically aggregates base staff salaries + all approved monthly marketer commissions into consolidated payslips ready for bank export.</w:t>
+        <w:br/>
+        <w:t>• Staff Governance: Employee leave applications, staff submissions/reports, onboarding checklists, and disciplinary/review logs.</w:t>
+      </w:r>
+    </w:p>
+    <w:p>
+      <w:pPr>
+        <w:pStyle w:val="Heading2"/>
+      </w:pPr>
+      <w:r>
+        <w:rPr>
+          <w:color w:val="FEA500"/>
+          <w:sz w:val="23"/>
+        </w:rPr>
+        <w:t>11. Cloud File Storage &amp; Digital Asset Vault</w:t>
+      </w:r>
+    </w:p>
+    <w:p>
+      <w:pPr>
+        <w:spacing w:line="288" w:lineRule="auto" w:after="160"/>
+      </w:pPr>
+      <w:r>
+        <w:t>• Enterprise Document Repository: Create structured folders for Estate Layouts, Survey Plans, Land Titles, and Corporate Documents.</w:t>
+        <w:br/>
+        <w:t>• Granular Actions: Upload, preview, rename, and download high-resolution architectural files securely.</w:t>
+      </w:r>
+    </w:p>
+    <w:p>
+      <w:pPr>
+        <w:pStyle w:val="Heading2"/>
+      </w:pPr>
+      <w:r>
+        <w:rPr>
+          <w:color w:val="FEA500"/>
+          <w:sz w:val="23"/>
+        </w:rPr>
+        <w:t>12. Virtual 3D Tour Integration (Prototype)</w:t>
+      </w:r>
+    </w:p>
+    <w:p>
+      <w:pPr>
+        <w:spacing w:line="288" w:lineRule="auto" w:after="160"/>
+      </w:pPr>
+      <w:r>
+        <w:t>• Interactive Visual Walkthrough: Embedded virtual tour exploration for prospective buyers to experience estate environments remotely.</w:t>
+      </w:r>
+    </w:p>
+    <w:p>
+      <w:pPr>
+        <w:pStyle w:val="Heading2"/>
+      </w:pPr>
+      <w:r>
+        <w:rPr>
+          <w:color w:val="FEA500"/>
+          <w:sz w:val="23"/>
+        </w:rPr>
+        <w:t>13. Multi-Branch Operations &amp; Consolidated Reporting</w:t>
+      </w:r>
+    </w:p>
+    <w:p>
+      <w:pPr>
+        <w:spacing w:line="288" w:lineRule="auto" w:after="160"/>
+      </w:pPr>
+      <w:r>
+        <w:t>• Multi-Branch Switching: Filter the entire CRM across Head Office, Island Branch, Mainland Branch, or regional offices.</w:t>
+        <w:br/>
+        <w:t>• Executive Export Suite: 1-click CSV/Excel exports for Leads by Source, Sales by Agent, Follow-Up Compliance, and Branch Comparisons.</w:t>
       </w:r>
     </w:p>
     <w:p>
@@ -789,7 +928,7 @@
           <w:color w:val="0F172A"/>
           <w:sz w:val="22"/>
         </w:rPr>
-        <w:t>Step 1: Capturing &amp; Importing Inbound Leads</w:t>
+        <w:t>SOP 1: Prospecting &amp; Lead Ingestion</w:t>
       </w:r>
     </w:p>
     <w:p>
@@ -815,7 +954,7 @@
           <w:color w:val="0F172A"/>
           <w:sz w:val="22"/>
         </w:rPr>
-        <w:t>Step 2: Closing a Deal &amp; Scheduling Part-Payments</w:t>
+        <w:t>SOP 2: Reserving a Unit &amp; Recording a Deal</w:t>
       </w:r>
     </w:p>
     <w:p>
@@ -831,7 +970,7 @@
         <w:br/>
         <w:t>4. Enter the Bank Teller / Transfer Reference and click 'Close Deal &amp; Generate Plan'.</w:t>
         <w:br/>
-        <w:t>5. The system automatically issues Milestone 1 as Paid and schedules the remaining monthly tranches.</w:t>
+        <w:t>5. The system issues Milestone 1 as Paid, generates the official stamped PDF receipt, and emails it to the buyer.</w:t>
       </w:r>
     </w:p>
     <w:p>
@@ -843,7 +982,7 @@
           <w:color w:val="0F172A"/>
           <w:sz w:val="22"/>
         </w:rPr>
-        <w:t>Step 3: Admin Payment Verification &amp; Marketer Commission Payout</w:t>
+        <w:t>SOP 3: Admin Payment Verification &amp; Commission Approval</w:t>
       </w:r>
     </w:p>
     <w:p>
@@ -869,7 +1008,7 @@
           <w:color w:val="0F172A"/>
           <w:sz w:val="22"/>
         </w:rPr>
-        <w:t>Step 4: Sharing the 1-Tap Client Portal with the Buyer</w:t>
+        <w:t>SOP 4: Sharing the 1-Tap Client Portal with the Buyer</w:t>
       </w:r>
     </w:p>
     <w:p>
@@ -893,7 +1032,33 @@
           <w:color w:val="0F172A"/>
           <w:sz w:val="22"/>
         </w:rPr>
-        <w:t>Step 5: Executing Monthly Staff Payroll</w:t>
+        <w:t>SOP 5: Generating Legal Allocation / Contract Documents</w:t>
+      </w:r>
+    </w:p>
+    <w:p>
+      <w:pPr>
+        <w:spacing w:line="276" w:lineRule="auto" w:after="120"/>
+      </w:pPr>
+      <w:r>
+        <w:t>1. Open 'Legal &amp; Documents' -&gt; 'Generated Documents' -&gt; Click 'Generate Document'.</w:t>
+        <w:br/>
+        <w:t>2. Select the Lead and the Template (e.g. Deed of Agreement / Allocation Letter).</w:t>
+        <w:br/>
+        <w:t>3. The system compiles the dynamic PDF, populating client details, plot allocation, and payment history.</w:t>
+        <w:br/>
+        <w:t>4. 1-Click 'Email to Client' or download the signed document.</w:t>
+      </w:r>
+    </w:p>
+    <w:p>
+      <w:pPr>
+        <w:pStyle w:val="Heading2"/>
+      </w:pPr>
+      <w:r>
+        <w:rPr>
+          <w:color w:val="0F172A"/>
+          <w:sz w:val="22"/>
+        </w:rPr>
+        <w:t>SOP 6: Executing Monthly Staff Payroll</w:t>
       </w:r>
     </w:p>
     <w:p>
@@ -907,7 +1072,7 @@
         <w:br/>
         <w:t>3. The system automatically computes Base Salary + All Verified Commissions.</w:t>
         <w:br/>
-        <w:t>4. Click 'Download Payslips' to print or email official PDF payslips to all staff.</w:t>
+        <w:t>4. Click 'Download Payslips' to print or email official PDF payslips to all staff, and export the bank transfer CSV.</w:t>
       </w:r>
     </w:p>
     <w:p>
@@ -918,12 +1083,12 @@
         <w:rPr>
           <w:color w:val="0F172A"/>
         </w:rPr>
-        <w:t>5. Technical Governance &amp; Maintenance</w:t>
+        <w:t>5. Technical Governance, Security &amp; Support SLA</w:t>
       </w:r>
     </w:p>
     <w:p>
       <w:r>
-        <w:t>NAW Property Flow CRM is continuously monitored and backed up under the technical stewardship of NAW World Technologies Limited. Automated server cron tasks manage email delivery queues, database backups, and security certificates 24 hours a day, 7 days a week.</w:t>
+        <w:t>NAW Property Flow CRM is hosted on an enterprise infrastructure configured and maintained by NAW World Technologies Limited. Automated server cron tasks manage email delivery queues, database backups, and security certificates 24 hours a day, 7 days a week.</w:t>
       </w:r>
     </w:p>
     <w:tbl>
@@ -1339,8 +1504,8 @@
     <w:rsid w:val="00FC693F"/>
     <w:rPr>
       <w:rFonts w:ascii="Calibri" w:hAnsi="Calibri"/>
-      <w:color w:val="2D3748"/>
-      <w:sz w:val="22"/>
+      <w:color w:val="1E293B"/>
+      <w:sz w:val="21"/>
     </w:rPr>
   </w:style>
   <w:style w:type="paragraph" w:styleId="Header">

</xml_diff>

<commit_message>
Publish Master Enterprise Product Architecture, Operational Manual & Governance Specification (.docx) for RICAF Nigeria Limited
</commit_message>
<xml_diff>
--- a/NAW_Property_Flow_CRM_RICAF_Product_Guide.docx
+++ b/NAW_Property_Flow_CRM_RICAF_Product_Guide.docx
@@ -18,10 +18,10 @@
             <w:tcW w:type="dxa" w:w="9936"/>
             <w:shd w:fill="0B132B"/>
             <w:tcMar>
-              <w:top w:w="300" w:type="dxa"/>
-              <w:bottom w:w="300" w:type="dxa"/>
-              <w:left w:w="300" w:type="dxa"/>
-              <w:right w:w="300" w:type="dxa"/>
+              <w:top w:w="320" w:type="dxa"/>
+              <w:bottom w:w="320" w:type="dxa"/>
+              <w:left w:w="320" w:type="dxa"/>
+              <w:right w:w="320" w:type="dxa"/>
             </w:tcMar>
           </w:tcPr>
           <w:p>
@@ -43,7 +43,7 @@
                 <w:color w:val="94A3B8"/>
                 <w:sz w:val="19"/>
               </w:rPr>
-              <w:t>Enterprise Division: NAW Property Flow CRM</w:t>
+              <w:t>Enterprise Software Division • NAW Property Flow CRM</w:t>
             </w:r>
           </w:p>
           <w:p>
@@ -51,9 +51,9 @@
               <w:rPr>
                 <w:b/>
                 <w:color w:val="FFFFFF"/>
-                <w:sz w:val="34"/>
+                <w:sz w:val="33"/>
               </w:rPr>
-              <w:t>COMPLETE PRODUCT ARCHITECTURE, MODULE DIRECTORY &amp; OPERATIONAL MANUAL</w:t>
+              <w:t>ENTERPRISE CRM PRODUCT ARCHITECTURE, OPERATIONAL MANUAL &amp; GOVERNANCE SPECIFICATION</w:t>
             </w:r>
           </w:p>
           <w:p>
@@ -61,9 +61,9 @@
               <w:rPr>
                 <w:b/>
                 <w:color w:val="FEA500"/>
-                <w:sz w:val="22"/>
+                <w:sz w:val="21"/>
               </w:rPr>
-              <w:t>Prepared Exclusively for: RICAF Nigeria Limited (crm.ricafltd.com)</w:t>
+              <w:t>Prepared Exclusively for the Executive Leadership &amp; Staff of: RICAF Nigeria Limited (crm.ricafltd.com)</w:t>
             </w:r>
           </w:p>
         </w:tc>
@@ -82,12 +82,12 @@
         <w:rPr>
           <w:color w:val="0F172A"/>
         </w:rPr>
-        <w:t>1. Executive Overview &amp; Mission</w:t>
+        <w:t>1. Executive Overview &amp; Strategic Vision</w:t>
       </w:r>
     </w:p>
     <w:p>
       <w:r>
-        <w:t>NAW Property Flow CRM is a state-of-the-art, multi-tenant enterprise real estate operating system engineered by NAW World Technologies Limited specifically for the sales, development, and administrative operations of RICAF Nigeria Limited. It unifies every dimension of real estate commerce—from raw digital lead acquisition and estate unit inventory reserving, to part-payment installment calculations, instant stamped PDF receipting, admin payment verification safeguards, automated marketer payroll commissions, and 1-tap client portal experiences.</w:t>
+        <w:t>NAW Property Flow CRM is a high-performance, enterprise-grade real estate operating system engineered by NAW World Technologies Limited specifically to power the sales, development, financial auditing, and human capital operations of RICAF Nigeria Limited. The platform establishes an automated, end-to-end digital nervous system that eliminates operational friction, accelerates deal velocity, secures payment compliance, and delivers a world-class luxury property ownership experience to local and diaspora investors.</w:t>
       </w:r>
     </w:p>
     <w:p>
@@ -98,12 +98,663 @@
         <w:rPr>
           <w:color w:val="0F172A"/>
         </w:rPr>
-        <w:t>2. Role-Based Security Matrix &amp; Organizational Workflows</w:t>
+        <w:t>2. Business Transformation &amp; ROI Matrix</w:t>
       </w:r>
     </w:p>
     <w:p>
       <w:r>
-        <w:t>To ensure total commercial confidentiality while empowering field sales agents, the CRM enforces rigorous role segregation:</w:t>
+        <w:t>By replacing manual spreadsheets, scattered paper receipts, and delayed approvals with NAW Property Flow CRM, RICAF Nigeria Limited realizes measurable operational advantages across key commercial dimensions:</w:t>
+      </w:r>
+    </w:p>
+    <w:tbl>
+      <w:tblPr>
+        <w:tblW w:type="auto" w:w="0"/>
+        <w:jc w:val="center"/>
+        <w:tblLayout w:type="fixed"/>
+        <w:tblLook w:firstColumn="1" w:firstRow="1" w:lastColumn="0" w:lastRow="0" w:noHBand="0" w:noVBand="1" w:val="04A0"/>
+      </w:tblPr>
+      <w:tblGrid>
+        <w:gridCol w:w="3312"/>
+        <w:gridCol w:w="3312"/>
+        <w:gridCol w:w="3312"/>
+      </w:tblGrid>
+      <w:tr>
+        <w:tc>
+          <w:tcPr>
+            <w:tcW w:type="dxa" w:w="2592"/>
+            <w:shd w:fill="1E293B"/>
+            <w:tcMar>
+              <w:top w:w="120" w:type="dxa"/>
+              <w:bottom w:w="120" w:type="dxa"/>
+              <w:left w:w="120" w:type="dxa"/>
+              <w:right w:w="120" w:type="dxa"/>
+            </w:tcMar>
+          </w:tcPr>
+          <w:p>
+            <w:r>
+              <w:rPr>
+                <w:b/>
+                <w:color w:val="FFFFFF"/>
+                <w:sz w:val="19"/>
+              </w:rPr>
+              <w:t>Operational Dimension</w:t>
+            </w:r>
+          </w:p>
+        </w:tc>
+        <w:tc>
+          <w:tcPr>
+            <w:tcW w:type="dxa" w:w="3600"/>
+            <w:shd w:fill="1E293B"/>
+            <w:tcMar>
+              <w:top w:w="120" w:type="dxa"/>
+              <w:bottom w:w="120" w:type="dxa"/>
+              <w:left w:w="120" w:type="dxa"/>
+              <w:right w:w="120" w:type="dxa"/>
+            </w:tcMar>
+          </w:tcPr>
+          <w:p>
+            <w:r>
+              <w:rPr>
+                <w:b/>
+                <w:color w:val="FFFFFF"/>
+                <w:sz w:val="19"/>
+              </w:rPr>
+              <w:t>Traditional Manual Operations</w:t>
+            </w:r>
+          </w:p>
+        </w:tc>
+        <w:tc>
+          <w:tcPr>
+            <w:tcW w:type="dxa" w:w="3744"/>
+            <w:shd w:fill="1E293B"/>
+            <w:tcMar>
+              <w:top w:w="120" w:type="dxa"/>
+              <w:bottom w:w="120" w:type="dxa"/>
+              <w:left w:w="120" w:type="dxa"/>
+              <w:right w:w="120" w:type="dxa"/>
+            </w:tcMar>
+          </w:tcPr>
+          <w:p>
+            <w:r>
+              <w:rPr>
+                <w:b/>
+                <w:color w:val="FFFFFF"/>
+                <w:sz w:val="19"/>
+              </w:rPr>
+              <w:t>NAW Property Flow CRM Impact</w:t>
+            </w:r>
+          </w:p>
+        </w:tc>
+      </w:tr>
+      <w:tr>
+        <w:tc>
+          <w:tcPr>
+            <w:tcW w:type="dxa" w:w="2592"/>
+            <w:shd w:fill="F8FAFC"/>
+            <w:tcMar>
+              <w:top w:w="100" w:type="dxa"/>
+              <w:bottom w:w="100" w:type="dxa"/>
+              <w:left w:w="100" w:type="dxa"/>
+              <w:right w:w="100" w:type="dxa"/>
+            </w:tcMar>
+          </w:tcPr>
+          <w:p>
+            <w:pPr>
+              <w:spacing w:line="276" w:lineRule="auto"/>
+            </w:pPr>
+            <w:r>
+              <w:rPr>
+                <w:b/>
+                <w:color w:val="0F172A"/>
+                <w:sz w:val="18"/>
+              </w:rPr>
+              <w:t>Marketer Lead Ownership &amp; Anti-Theft</w:t>
+            </w:r>
+          </w:p>
+        </w:tc>
+        <w:tc>
+          <w:tcPr>
+            <w:tcW w:type="dxa" w:w="3600"/>
+            <w:shd w:fill="FFFFFF"/>
+            <w:tcMar>
+              <w:top w:w="100" w:type="dxa"/>
+              <w:bottom w:w="100" w:type="dxa"/>
+              <w:left w:w="100" w:type="dxa"/>
+              <w:right w:w="100" w:type="dxa"/>
+            </w:tcMar>
+          </w:tcPr>
+          <w:p>
+            <w:pPr>
+              <w:spacing w:line="276" w:lineRule="auto"/>
+            </w:pPr>
+            <w:r>
+              <w:rPr>
+                <w:sz w:val="18"/>
+              </w:rPr>
+              <w:t>Internal disputes, client poaching, and lack of transparency over lead origination.</w:t>
+            </w:r>
+          </w:p>
+        </w:tc>
+        <w:tc>
+          <w:tcPr>
+            <w:tcW w:type="dxa" w:w="3744"/>
+            <w:shd w:fill="F8FAFC"/>
+            <w:tcMar>
+              <w:top w:w="100" w:type="dxa"/>
+              <w:bottom w:w="100" w:type="dxa"/>
+              <w:left w:w="100" w:type="dxa"/>
+              <w:right w:w="100" w:type="dxa"/>
+            </w:tcMar>
+          </w:tcPr>
+          <w:p>
+            <w:pPr>
+              <w:spacing w:line="276" w:lineRule="auto"/>
+            </w:pPr>
+            <w:r>
+              <w:rPr>
+                <w:color w:val="059669"/>
+                <w:sz w:val="18"/>
+              </w:rPr>
+              <w:t>100% Tamper-Proof. Leads are permanently locked to the capturing sales executive upon entry/import.</w:t>
+            </w:r>
+          </w:p>
+        </w:tc>
+      </w:tr>
+      <w:tr>
+        <w:tc>
+          <w:tcPr>
+            <w:tcW w:type="dxa" w:w="2592"/>
+            <w:shd w:fill="F8FAFC"/>
+            <w:tcMar>
+              <w:top w:w="100" w:type="dxa"/>
+              <w:bottom w:w="100" w:type="dxa"/>
+              <w:left w:w="100" w:type="dxa"/>
+              <w:right w:w="100" w:type="dxa"/>
+            </w:tcMar>
+          </w:tcPr>
+          <w:p>
+            <w:pPr>
+              <w:spacing w:line="276" w:lineRule="auto"/>
+            </w:pPr>
+            <w:r>
+              <w:rPr>
+                <w:b/>
+                <w:color w:val="0F172A"/>
+                <w:sz w:val="18"/>
+              </w:rPr>
+              <w:t>Receipt Issuance &amp; Dispatch Time</w:t>
+            </w:r>
+          </w:p>
+        </w:tc>
+        <w:tc>
+          <w:tcPr>
+            <w:tcW w:type="dxa" w:w="3600"/>
+            <w:shd w:fill="FFFFFF"/>
+            <w:tcMar>
+              <w:top w:w="100" w:type="dxa"/>
+              <w:bottom w:w="100" w:type="dxa"/>
+              <w:left w:w="100" w:type="dxa"/>
+              <w:right w:w="100" w:type="dxa"/>
+            </w:tcMar>
+          </w:tcPr>
+          <w:p>
+            <w:pPr>
+              <w:spacing w:line="276" w:lineRule="auto"/>
+            </w:pPr>
+            <w:r>
+              <w:rPr>
+                <w:sz w:val="18"/>
+              </w:rPr>
+              <w:t>24 to 48 hours of manual Word/Excel formatting, printing, signing, and emailing.</w:t>
+            </w:r>
+          </w:p>
+        </w:tc>
+        <w:tc>
+          <w:tcPr>
+            <w:tcW w:type="dxa" w:w="3744"/>
+            <w:shd w:fill="F8FAFC"/>
+            <w:tcMar>
+              <w:top w:w="100" w:type="dxa"/>
+              <w:bottom w:w="100" w:type="dxa"/>
+              <w:left w:w="100" w:type="dxa"/>
+              <w:right w:w="100" w:type="dxa"/>
+            </w:tcMar>
+          </w:tcPr>
+          <w:p>
+            <w:pPr>
+              <w:spacing w:line="276" w:lineRule="auto"/>
+            </w:pPr>
+            <w:r>
+              <w:rPr>
+                <w:color w:val="059669"/>
+                <w:sz w:val="18"/>
+              </w:rPr>
+              <w:t>Instant (0 Seconds). Branded, stamped PDF receipts (REC-XXXXXX) auto-generate and email immediately.</w:t>
+            </w:r>
+          </w:p>
+        </w:tc>
+      </w:tr>
+      <w:tr>
+        <w:tc>
+          <w:tcPr>
+            <w:tcW w:type="dxa" w:w="2592"/>
+            <w:shd w:fill="F8FAFC"/>
+            <w:tcMar>
+              <w:top w:w="100" w:type="dxa"/>
+              <w:bottom w:w="100" w:type="dxa"/>
+              <w:left w:w="100" w:type="dxa"/>
+              <w:right w:w="100" w:type="dxa"/>
+            </w:tcMar>
+          </w:tcPr>
+          <w:p>
+            <w:pPr>
+              <w:spacing w:line="276" w:lineRule="auto"/>
+            </w:pPr>
+            <w:r>
+              <w:rPr>
+                <w:b/>
+                <w:color w:val="0F172A"/>
+                <w:sz w:val="18"/>
+              </w:rPr>
+              <w:t>Financial Audit &amp; Commission Integrity</w:t>
+            </w:r>
+          </w:p>
+        </w:tc>
+        <w:tc>
+          <w:tcPr>
+            <w:tcW w:type="dxa" w:w="3600"/>
+            <w:shd w:fill="FFFFFF"/>
+            <w:tcMar>
+              <w:top w:w="100" w:type="dxa"/>
+              <w:bottom w:w="100" w:type="dxa"/>
+              <w:left w:w="100" w:type="dxa"/>
+              <w:right w:w="100" w:type="dxa"/>
+            </w:tcMar>
+          </w:tcPr>
+          <w:p>
+            <w:pPr>
+              <w:spacing w:line="276" w:lineRule="auto"/>
+            </w:pPr>
+            <w:r>
+              <w:rPr>
+                <w:sz w:val="18"/>
+              </w:rPr>
+              <w:t>Overpayments, unverified commissions paid on bounced transfers, spreadsheet errors.</w:t>
+            </w:r>
+          </w:p>
+        </w:tc>
+        <w:tc>
+          <w:tcPr>
+            <w:tcW w:type="dxa" w:w="3744"/>
+            <w:shd w:fill="F8FAFC"/>
+            <w:tcMar>
+              <w:top w:w="100" w:type="dxa"/>
+              <w:bottom w:w="100" w:type="dxa"/>
+              <w:left w:w="100" w:type="dxa"/>
+              <w:right w:w="100" w:type="dxa"/>
+            </w:tcMar>
+          </w:tcPr>
+          <w:p>
+            <w:pPr>
+              <w:spacing w:line="276" w:lineRule="auto"/>
+            </w:pPr>
+            <w:r>
+              <w:rPr>
+                <w:color w:val="059669"/>
+                <w:sz w:val="18"/>
+              </w:rPr>
+              <w:t>Two-Tier Audit Safeguard: Marketer commissions strictly queue until Admin audits bank funds.</w:t>
+            </w:r>
+          </w:p>
+        </w:tc>
+      </w:tr>
+      <w:tr>
+        <w:tc>
+          <w:tcPr>
+            <w:tcW w:type="dxa" w:w="2592"/>
+            <w:shd w:fill="F8FAFC"/>
+            <w:tcMar>
+              <w:top w:w="100" w:type="dxa"/>
+              <w:bottom w:w="100" w:type="dxa"/>
+              <w:left w:w="100" w:type="dxa"/>
+              <w:right w:w="100" w:type="dxa"/>
+            </w:tcMar>
+          </w:tcPr>
+          <w:p>
+            <w:pPr>
+              <w:spacing w:line="276" w:lineRule="auto"/>
+            </w:pPr>
+            <w:r>
+              <w:rPr>
+                <w:b/>
+                <w:color w:val="0F172A"/>
+                <w:sz w:val="18"/>
+              </w:rPr>
+              <w:t>Diaspora &amp; Remote Investor Trust</w:t>
+            </w:r>
+          </w:p>
+        </w:tc>
+        <w:tc>
+          <w:tcPr>
+            <w:tcW w:type="dxa" w:w="3600"/>
+            <w:shd w:fill="FFFFFF"/>
+            <w:tcMar>
+              <w:top w:w="100" w:type="dxa"/>
+              <w:bottom w:w="100" w:type="dxa"/>
+              <w:left w:w="100" w:type="dxa"/>
+              <w:right w:w="100" w:type="dxa"/>
+            </w:tcMar>
+          </w:tcPr>
+          <w:p>
+            <w:pPr>
+              <w:spacing w:line="276" w:lineRule="auto"/>
+            </w:pPr>
+            <w:r>
+              <w:rPr>
+                <w:sz w:val="18"/>
+              </w:rPr>
+              <w:t>High client anxiety over unverified progress, lost paper documents, repetitive support calls.</w:t>
+            </w:r>
+          </w:p>
+        </w:tc>
+        <w:tc>
+          <w:tcPr>
+            <w:tcW w:type="dxa" w:w="3744"/>
+            <w:shd w:fill="F8FAFC"/>
+            <w:tcMar>
+              <w:top w:w="100" w:type="dxa"/>
+              <w:bottom w:w="100" w:type="dxa"/>
+              <w:left w:w="100" w:type="dxa"/>
+              <w:right w:w="100" w:type="dxa"/>
+            </w:tcMar>
+          </w:tcPr>
+          <w:p>
+            <w:pPr>
+              <w:spacing w:line="276" w:lineRule="auto"/>
+            </w:pPr>
+            <w:r>
+              <w:rPr>
+                <w:color w:val="059669"/>
+                <w:sz w:val="18"/>
+              </w:rPr>
+              <w:t>24/7 1-Tap Client Portal on mobile: Real-time milestone progress, photo feeds, and statements.</w:t>
+            </w:r>
+          </w:p>
+        </w:tc>
+      </w:tr>
+      <w:tr>
+        <w:tc>
+          <w:tcPr>
+            <w:tcW w:type="dxa" w:w="2592"/>
+            <w:shd w:fill="F8FAFC"/>
+            <w:tcMar>
+              <w:top w:w="100" w:type="dxa"/>
+              <w:bottom w:w="100" w:type="dxa"/>
+              <w:left w:w="100" w:type="dxa"/>
+              <w:right w:w="100" w:type="dxa"/>
+            </w:tcMar>
+          </w:tcPr>
+          <w:p>
+            <w:pPr>
+              <w:spacing w:line="276" w:lineRule="auto"/>
+            </w:pPr>
+            <w:r>
+              <w:rPr>
+                <w:b/>
+                <w:color w:val="0F172A"/>
+                <w:sz w:val="18"/>
+              </w:rPr>
+              <w:t>Monthly Staff &amp; Commission Payroll</w:t>
+            </w:r>
+          </w:p>
+        </w:tc>
+        <w:tc>
+          <w:tcPr>
+            <w:tcW w:type="dxa" w:w="3600"/>
+            <w:shd w:fill="FFFFFF"/>
+            <w:tcMar>
+              <w:top w:w="100" w:type="dxa"/>
+              <w:bottom w:w="100" w:type="dxa"/>
+              <w:left w:w="100" w:type="dxa"/>
+              <w:right w:w="100" w:type="dxa"/>
+            </w:tcMar>
+          </w:tcPr>
+          <w:p>
+            <w:pPr>
+              <w:spacing w:line="276" w:lineRule="auto"/>
+            </w:pPr>
+            <w:r>
+              <w:rPr>
+                <w:sz w:val="18"/>
+              </w:rPr>
+              <w:t>3 to 5 working days of tedious accounting, recalculating commission tiers by hand.</w:t>
+            </w:r>
+          </w:p>
+        </w:tc>
+        <w:tc>
+          <w:tcPr>
+            <w:tcW w:type="dxa" w:w="3744"/>
+            <w:shd w:fill="F8FAFC"/>
+            <w:tcMar>
+              <w:top w:w="100" w:type="dxa"/>
+              <w:bottom w:w="100" w:type="dxa"/>
+              <w:left w:w="100" w:type="dxa"/>
+              <w:right w:w="100" w:type="dxa"/>
+            </w:tcMar>
+          </w:tcPr>
+          <w:p>
+            <w:pPr>
+              <w:spacing w:line="276" w:lineRule="auto"/>
+            </w:pPr>
+            <w:r>
+              <w:rPr>
+                <w:color w:val="059669"/>
+                <w:sz w:val="18"/>
+              </w:rPr>
+              <w:t>1-Click Automated Generation: Base salary + verified commissions compiled in under 10 seconds.</w:t>
+            </w:r>
+          </w:p>
+        </w:tc>
+      </w:tr>
+      <w:tr>
+        <w:tc>
+          <w:tcPr>
+            <w:tcW w:type="dxa" w:w="2592"/>
+            <w:shd w:fill="F8FAFC"/>
+            <w:tcMar>
+              <w:top w:w="100" w:type="dxa"/>
+              <w:bottom w:w="100" w:type="dxa"/>
+              <w:left w:w="100" w:type="dxa"/>
+              <w:right w:w="100" w:type="dxa"/>
+            </w:tcMar>
+          </w:tcPr>
+          <w:p>
+            <w:pPr>
+              <w:spacing w:line="276" w:lineRule="auto"/>
+            </w:pPr>
+            <w:r>
+              <w:rPr>
+                <w:b/>
+                <w:color w:val="0F172A"/>
+                <w:sz w:val="18"/>
+              </w:rPr>
+              <w:t>Marketing &amp; Lead Conversion</w:t>
+            </w:r>
+          </w:p>
+        </w:tc>
+        <w:tc>
+          <w:tcPr>
+            <w:tcW w:type="dxa" w:w="3600"/>
+            <w:shd w:fill="FFFFFF"/>
+            <w:tcMar>
+              <w:top w:w="100" w:type="dxa"/>
+              <w:bottom w:w="100" w:type="dxa"/>
+              <w:left w:w="100" w:type="dxa"/>
+              <w:right w:w="100" w:type="dxa"/>
+            </w:tcMar>
+          </w:tcPr>
+          <w:p>
+            <w:pPr>
+              <w:spacing w:line="276" w:lineRule="auto"/>
+            </w:pPr>
+            <w:r>
+              <w:rPr>
+                <w:sz w:val="18"/>
+              </w:rPr>
+              <w:t>Cold outreach with no tracking, unorganized WhatsApp broadcasts, lost follow-ups.</w:t>
+            </w:r>
+          </w:p>
+        </w:tc>
+        <w:tc>
+          <w:tcPr>
+            <w:tcW w:type="dxa" w:w="3744"/>
+            <w:shd w:fill="F8FAFC"/>
+            <w:tcMar>
+              <w:top w:w="100" w:type="dxa"/>
+              <w:bottom w:w="100" w:type="dxa"/>
+              <w:left w:w="100" w:type="dxa"/>
+              <w:right w:w="100" w:type="dxa"/>
+            </w:tcMar>
+          </w:tcPr>
+          <w:p>
+            <w:pPr>
+              <w:spacing w:line="276" w:lineRule="auto"/>
+            </w:pPr>
+            <w:r>
+              <w:rPr>
+                <w:color w:val="059669"/>
+                <w:sz w:val="18"/>
+              </w:rPr>
+              <w:t>Automated Drip Sequences, Lead Scoring, Overdue Follow-Up Alerts, and Click/Open Analytics.</w:t>
+            </w:r>
+          </w:p>
+        </w:tc>
+      </w:tr>
+    </w:tbl>
+    <w:p>
+      <w:pPr>
+        <w:spacing w:after="240"/>
+      </w:pPr>
+    </w:p>
+    <w:p>
+      <w:pPr>
+        <w:pStyle w:val="Heading1"/>
+      </w:pPr>
+      <w:r>
+        <w:rPr>
+          <w:color w:val="0F172A"/>
+        </w:rPr>
+        <w:t>3. End-to-End Operational Lifecycle &amp; Data Flow</w:t>
+      </w:r>
+    </w:p>
+    <w:p>
+      <w:r>
+        <w:t>The following structured flowchart illustrates how customer prospects transition seamlessly through the CRM lifecycle into closed sales, audited funds, automated commissions, and lifelong investor portal engagement:</w:t>
+      </w:r>
+    </w:p>
+    <w:p>
+      <w:pPr>
+        <w:spacing w:line="252" w:lineRule="auto" w:after="240"/>
+      </w:pPr>
+      <w:r>
+        <w:rPr>
+          <w:rFonts w:ascii="Consolas" w:hAnsi="Consolas"/>
+          <w:color w:val="0F172A"/>
+          <w:sz w:val="16"/>
+        </w:rPr>
+        <w:t>┌────────────────────────────────────────────────────────────────────────────────────────┐</w:t>
+        <w:br/>
+        <w:t>│                             1. LEAD ACQUISITION &amp; CAPTURE                              │</w:t>
+        <w:br/>
+        <w:t>│  • Channels: Website Inquiries, WhatsApp, Social Media Ads, Cold Calls, Bulk CSV Import│</w:t>
+        <w:br/>
+        <w:t>│  • Safeguard: Permanent ownership lock to the originating Sales Executive (Marketer)   │</w:t>
+        <w:br/>
+        <w:t>└───────────────────────────────────────────┬────────────────────────────────────────────┘</w:t>
+        <w:br/>
+        <w:t xml:space="preserve">                                            ▼</w:t>
+        <w:br/>
+        <w:t>┌────────────────────────────────────────────────────────────────────────────────────────┐</w:t>
+        <w:br/>
+        <w:t>│                           2. LEAD NURTURING &amp; KANBAN STAGING                           │</w:t>
+        <w:br/>
+        <w:t>│  • Stages: New ➔ Contacted ➔ Follow-Up Scheduled ➔ Site Inspection Booked ➔ Negotiation│</w:t>
+        <w:br/>
+        <w:t>│  • Real-time Top KPI Counters: Total Pipeline, New Prospects, Conversion Rate %        │</w:t>
+        <w:br/>
+        <w:t>└───────────────────────────────────────────┬────────────────────────────────────────────┘</w:t>
+        <w:br/>
+        <w:t xml:space="preserve">                                            ▼</w:t>
+        <w:br/>
+        <w:t>┌────────────────────────────────────────────────────────────────────────────────────────┐</w:t>
+        <w:br/>
+        <w:t>│                         3. DEAL CLOSING &amp; PART-PAYMENT SPREAD                          │</w:t>
+        <w:br/>
+        <w:t>│  • Unit Reserving: Specific plot selected (Available ➔ Reserved ➔ Sold)               │</w:t>
+        <w:br/>
+        <w:t>│  • Live Calculator: 100% Outright vs Part-Payment Spread (3 to 24 Months)              │</w:t>
+        <w:br/>
+        <w:t>│  • Milestone Scheduling: Milestone 1 (Deposit) receipted; remaining tranches scheduled │</w:t>
+        <w:br/>
+        <w:t>└───────────────────────────────────────────┬────────────────────────────────────────────┘</w:t>
+        <w:br/>
+        <w:t xml:space="preserve">                                            ▼</w:t>
+        <w:br/>
+        <w:t>┌────────────────────────────────────────────────────────────────────────────────────────┐</w:t>
+        <w:br/>
+        <w:t>│                  4. INSTANT PDF RECEIPT &amp; 1-TAP CLIENT PORTAL SHARING                  │</w:t>
+        <w:br/>
+        <w:t>│  • Official Stamped PDF Receipt (REC-XXXXXX) auto-emailed to buyer inbox               │</w:t>
+        <w:br/>
+        <w:t>│  • 1-Click WhatsApp Sharing: 64-Hex Cryptographic Magic Link sent to client's phone   │</w:t>
+        <w:br/>
+        <w:t>│  • Buyer Portal: Client tracks live site photos, allocation letters, and balances 24/7 │</w:t>
+        <w:br/>
+        <w:t>└───────────────────────────────────────────┬────────────────────────────────────────────┘</w:t>
+        <w:br/>
+        <w:t xml:space="preserve">                                            ▼</w:t>
+        <w:br/>
+        <w:t>┌────────────────────────────────────────────────────────────────────────────────────────┐</w:t>
+        <w:br/>
+        <w:t>│                   5. ADMIN PAYMENT VERIFICATION &amp; COMMISSION APPROVAL                  │</w:t>
+        <w:br/>
+        <w:t>│  • Two-Tier Financial Audit: Payment sits as 'Pending Audit' until bank credit verified│</w:t>
+        <w:br/>
+        <w:t>│  • Admin Sign-Off: Super Admin / Company Admin clicks 'Verify Payment'                │</w:t>
+        <w:br/>
+        <w:t>│  • Commission Queuing: Marketer commission moves to 'Approved' status                  │</w:t>
+        <w:br/>
+        <w:t>└───────────────────────────────────────────┬────────────────────────────────────────────┘</w:t>
+        <w:br/>
+        <w:t xml:space="preserve">                                            ▼</w:t>
+        <w:br/>
+        <w:t>┌────────────────────────────────────────────────────────────────────────────────────────┐</w:t>
+        <w:br/>
+        <w:t>│                  6. MONTHLY PAYROLL GENERATION &amp; LEADERBOARD RECOGNITION               │</w:t>
+        <w:br/>
+        <w:t>│  • 1-Click Monthly Payroll: Aggregates Base Salaries + Approved Commissions into PDF   │</w:t>
+        <w:br/>
+        <w:t>│  • Bank Schedule Export: Instant CSV for electronic banking disbursement               │</w:t>
+        <w:br/>
+        <w:t>│  • Sales Leaderboard: Live 🥇 Gold, 🥈 Silver, 🥉 Bronze rankings &amp; targets             │</w:t>
+        <w:br/>
+        <w:t>└────────────────────────────────────────────────────────────────────────────────────────┘</w:t>
+      </w:r>
+    </w:p>
+    <w:p>
+      <w:pPr>
+        <w:pStyle w:val="Heading1"/>
+      </w:pPr>
+      <w:r>
+        <w:rPr>
+          <w:color w:val="0F172A"/>
+        </w:rPr>
+        <w:t>4. Role-Based Security Matrix &amp; Permissions</w:t>
+      </w:r>
+    </w:p>
+    <w:p>
+      <w:r>
+        <w:t>The system enforces strict access control across all 5 operational roles to ensure data privacy and prevent unauthorized actions:</w:t>
       </w:r>
     </w:p>
     <w:tbl>
@@ -593,7 +1244,7 @@
         <w:rPr>
           <w:color w:val="0F172A"/>
         </w:rPr>
-        <w:t>3. Exhaustive Core Feature Directory</w:t>
+        <w:t>5. Exhaustive Core Feature Directory</w:t>
       </w:r>
     </w:p>
     <w:p>
@@ -916,7 +1567,7 @@
         <w:rPr>
           <w:color w:val="0F172A"/>
         </w:rPr>
-        <w:t>4. Standard Operating Procedures (SOP)</w:t>
+        <w:t>6. Standard Operating Procedures (SOP)</w:t>
       </w:r>
     </w:p>
     <w:p>
@@ -928,7 +1579,7 @@
           <w:color w:val="0F172A"/>
           <w:sz w:val="22"/>
         </w:rPr>
-        <w:t>SOP 1: Prospecting &amp; Lead Ingestion</w:t>
+        <w:t>SOP 1: Inbound Lead Capture &amp; Bulk CSV Import</w:t>
       </w:r>
     </w:p>
     <w:p>
@@ -954,7 +1605,7 @@
           <w:color w:val="0F172A"/>
           <w:sz w:val="22"/>
         </w:rPr>
-        <w:t>SOP 2: Reserving a Unit &amp; Recording a Deal</w:t>
+        <w:t>SOP 2: Reserving a Unit &amp; Recording a Deal with Part-Payment Spread</w:t>
       </w:r>
     </w:p>
     <w:p>
@@ -982,7 +1633,7 @@
           <w:color w:val="0F172A"/>
           <w:sz w:val="22"/>
         </w:rPr>
-        <w:t>SOP 3: Admin Payment Verification &amp; Commission Approval</w:t>
+        <w:t>SOP 3: Admin Payment Verification &amp; Marketer Commission Approval</w:t>
       </w:r>
     </w:p>
     <w:p>
@@ -1032,7 +1683,7 @@
           <w:color w:val="0F172A"/>
           <w:sz w:val="22"/>
         </w:rPr>
-        <w:t>SOP 5: Generating Legal Allocation / Contract Documents</w:t>
+        <w:t>SOP 5: Generating Legal Allocation &amp; Contract Documents</w:t>
       </w:r>
     </w:p>
     <w:p>
@@ -1058,7 +1709,7 @@
           <w:color w:val="0F172A"/>
           <w:sz w:val="22"/>
         </w:rPr>
-        <w:t>SOP 6: Executing Monthly Staff Payroll</w:t>
+        <w:t>SOP 6: Running Monthly Staff Payroll &amp; Exporting Bank Schedules</w:t>
       </w:r>
     </w:p>
     <w:p>
@@ -1083,13 +1734,709 @@
         <w:rPr>
           <w:color w:val="0F172A"/>
         </w:rPr>
-        <w:t>5. Technical Governance, Security &amp; Support SLA</w:t>
+        <w:t>7. Troubleshooting &amp; Field Exception Protocols</w:t>
+      </w:r>
+    </w:p>
+    <w:p>
+      <w:pPr>
+        <w:pStyle w:val="Heading2"/>
+      </w:pPr>
+      <w:r>
+        <w:rPr>
+          <w:color w:val="0F172A"/>
+          <w:sz w:val="21"/>
+        </w:rPr>
+        <w:t>Q1: What happens if a buyer makes a payment with an unclear transfer description?</w:t>
+      </w:r>
+    </w:p>
+    <w:p>
+      <w:pPr>
+        <w:spacing w:line="276" w:lineRule="auto" w:after="120"/>
+      </w:pPr>
+      <w:r>
+        <w:t>Resolution Protocol: The marketer logs the payment with the available bank transaction reference and notes. The milestone enters 'Pending Audit'. The Company Admin or Finance Officer cross-checks with the corporate bank statement before clicking 'Verify Payment'. Commissions are held safely until positive bank confirmation.</w:t>
+      </w:r>
+    </w:p>
+    <w:p>
+      <w:pPr>
+        <w:pStyle w:val="Heading2"/>
+      </w:pPr>
+      <w:r>
+        <w:rPr>
+          <w:color w:val="0F172A"/>
+          <w:sz w:val="21"/>
+        </w:rPr>
+        <w:t>Q2: Can a Sales Executive change who a lead is assigned to?</w:t>
+      </w:r>
+    </w:p>
+    <w:p>
+      <w:pPr>
+        <w:spacing w:line="276" w:lineRule="auto" w:after="120"/>
+      </w:pPr>
+      <w:r>
+        <w:t>Resolution Protocol: No. To prevent lead tampering or internal commission disputes, sales executives cannot modify the 'assigned_to' field. If an agent goes on leave or leaves the company, only a Sales Manager or Company Admin can reassign the lead.</w:t>
+      </w:r>
+    </w:p>
+    <w:p>
+      <w:pPr>
+        <w:pStyle w:val="Heading2"/>
+      </w:pPr>
+      <w:r>
+        <w:rPr>
+          <w:color w:val="0F172A"/>
+          <w:sz w:val="21"/>
+        </w:rPr>
+        <w:t>Q3: What if a client requests to extend their part-payment spread (e.g., from 6 to 12 months)?</w:t>
+      </w:r>
+    </w:p>
+    <w:p>
+      <w:pPr>
+        <w:spacing w:line="276" w:lineRule="auto" w:after="120"/>
+      </w:pPr>
+      <w:r>
+        <w:t>Resolution Protocol: An Admin can navigate to 'Payments &amp; Milestones' -&gt; 'Payment Plan' -&gt; Adjust the remaining milestone tranches to spread across the newly agreed timeline.</w:t>
+      </w:r>
+    </w:p>
+    <w:p>
+      <w:pPr>
+        <w:pStyle w:val="Heading2"/>
+      </w:pPr>
+      <w:r>
+        <w:rPr>
+          <w:color w:val="0F172A"/>
+          <w:sz w:val="21"/>
+        </w:rPr>
+        <w:t>Q4: How does a diaspora client access their portal if they lose their WhatsApp chat?</w:t>
+      </w:r>
+    </w:p>
+    <w:p>
+      <w:pPr>
+        <w:spacing w:line="276" w:lineRule="auto" w:after="120"/>
+      </w:pPr>
+      <w:r>
+        <w:t>Resolution Protocol: The marketer or admin can open the client's file in the CRM (/leads/{id}) and click 'Copy Access Link' or 'Share on WhatsApp' again. The 64-hex cryptographic token regenerates seamlessly without resetting any client data.</w:t>
+      </w:r>
+    </w:p>
+    <w:p>
+      <w:pPr>
+        <w:pStyle w:val="Heading1"/>
+      </w:pPr>
+      <w:r>
+        <w:rPr>
+          <w:color w:val="0F172A"/>
+        </w:rPr>
+        <w:t>8. Enterprise Security, Data Privacy &amp; NDPR Compliance</w:t>
       </w:r>
     </w:p>
     <w:p>
       <w:r>
-        <w:t>NAW Property Flow CRM is hosted on an enterprise infrastructure configured and maintained by NAW World Technologies Limited. Automated server cron tasks manage email delivery queues, database backups, and security certificates 24 hours a day, 7 days a week.</w:t>
+        <w:t>NAW Property Flow CRM is built in strict adherence to modern cybersecurity standards and the Nigeria Data Protection Regulation (NDPR):</w:t>
       </w:r>
+    </w:p>
+    <w:p>
+      <w:pPr>
+        <w:spacing w:line="288" w:lineRule="auto" w:after="200"/>
+      </w:pPr>
+      <w:r>
+        <w:t>• Cryptographic Token Security: Client portal magic links use 256-bit entropy random tokens (bin2hex(random_bytes(32))), mathematically impervious to brute-force guessing.</w:t>
+        <w:br/>
+        <w:t>• Transport Layer Security (TLS/SSL): 100% of data traffic, client documents, and login credentials are encrypted in transit via 256-bit SSL.</w:t>
+        <w:br/>
+        <w:t>• Multi-Tenant Data Isolation: Database queries are tenant-scoped, ensuring complete isolation of customer data from any external systems.</w:t>
+        <w:br/>
+        <w:t>• Automated Server Backups &amp; Disaster Recovery: Automated database snapshots run continuously on cPanel server infrastructure.</w:t>
+        <w:br/>
+        <w:t>• Comprehensive Audit Trail: Critical operational events (logins, payment records, role changes, document downloads) are timestamped and logged.</w:t>
+      </w:r>
+    </w:p>
+    <w:p>
+      <w:pPr>
+        <w:pStyle w:val="Heading1"/>
+      </w:pPr>
+      <w:r>
+        <w:rPr>
+          <w:color w:val="0F172A"/>
+        </w:rPr>
+        <w:t>9. 30-Day Onboarding &amp; Implementation Roadmap</w:t>
+      </w:r>
+    </w:p>
+    <w:tbl>
+      <w:tblPr>
+        <w:tblW w:type="auto" w:w="0"/>
+        <w:jc w:val="center"/>
+        <w:tblLayout w:type="fixed"/>
+        <w:tblLook w:firstColumn="1" w:firstRow="1" w:lastColumn="0" w:lastRow="0" w:noHBand="0" w:noVBand="1" w:val="04A0"/>
+      </w:tblPr>
+      <w:tblGrid>
+        <w:gridCol w:w="3312"/>
+        <w:gridCol w:w="3312"/>
+        <w:gridCol w:w="3312"/>
+      </w:tblGrid>
+      <w:tr>
+        <w:tc>
+          <w:tcPr>
+            <w:tcW w:type="dxa" w:w="1872"/>
+            <w:shd w:fill="1E293B"/>
+            <w:tcMar>
+              <w:top w:w="120" w:type="dxa"/>
+              <w:bottom w:w="120" w:type="dxa"/>
+              <w:left w:w="120" w:type="dxa"/>
+              <w:right w:w="120" w:type="dxa"/>
+            </w:tcMar>
+          </w:tcPr>
+          <w:p>
+            <w:r>
+              <w:rPr>
+                <w:b/>
+                <w:color w:val="FFFFFF"/>
+                <w:sz w:val="19"/>
+              </w:rPr>
+              <w:t>Phase / Timeline</w:t>
+            </w:r>
+          </w:p>
+        </w:tc>
+        <w:tc>
+          <w:tcPr>
+            <w:tcW w:type="dxa" w:w="3168"/>
+            <w:shd w:fill="1E293B"/>
+            <w:tcMar>
+              <w:top w:w="120" w:type="dxa"/>
+              <w:bottom w:w="120" w:type="dxa"/>
+              <w:left w:w="120" w:type="dxa"/>
+              <w:right w:w="120" w:type="dxa"/>
+            </w:tcMar>
+          </w:tcPr>
+          <w:p>
+            <w:r>
+              <w:rPr>
+                <w:b/>
+                <w:color w:val="FFFFFF"/>
+                <w:sz w:val="19"/>
+              </w:rPr>
+              <w:t>Focus Area</w:t>
+            </w:r>
+          </w:p>
+        </w:tc>
+        <w:tc>
+          <w:tcPr>
+            <w:tcW w:type="dxa" w:w="4896"/>
+            <w:shd w:fill="1E293B"/>
+            <w:tcMar>
+              <w:top w:w="120" w:type="dxa"/>
+              <w:bottom w:w="120" w:type="dxa"/>
+              <w:left w:w="120" w:type="dxa"/>
+              <w:right w:w="120" w:type="dxa"/>
+            </w:tcMar>
+          </w:tcPr>
+          <w:p>
+            <w:r>
+              <w:rPr>
+                <w:b/>
+                <w:color w:val="FFFFFF"/>
+                <w:sz w:val="19"/>
+              </w:rPr>
+              <w:t>Milestones &amp; Key Deliverables</w:t>
+            </w:r>
+          </w:p>
+        </w:tc>
+      </w:tr>
+      <w:tr>
+        <w:tc>
+          <w:tcPr>
+            <w:tcW w:type="dxa" w:w="1872"/>
+            <w:shd w:fill="F8FAFC"/>
+            <w:tcMar>
+              <w:top w:w="100" w:type="dxa"/>
+              <w:bottom w:w="100" w:type="dxa"/>
+              <w:left w:w="100" w:type="dxa"/>
+              <w:right w:w="100" w:type="dxa"/>
+            </w:tcMar>
+          </w:tcPr>
+          <w:p>
+            <w:pPr>
+              <w:spacing w:line="276" w:lineRule="auto"/>
+            </w:pPr>
+            <w:r>
+              <w:rPr>
+                <w:b/>
+                <w:color w:val="0F172A"/>
+                <w:sz w:val="18"/>
+              </w:rPr>
+              <w:t>Week 1 (Days 1–7)</w:t>
+            </w:r>
+          </w:p>
+        </w:tc>
+        <w:tc>
+          <w:tcPr>
+            <w:tcW w:type="dxa" w:w="3168"/>
+            <w:shd w:fill="FFFFFF"/>
+            <w:tcMar>
+              <w:top w:w="100" w:type="dxa"/>
+              <w:bottom w:w="100" w:type="dxa"/>
+              <w:left w:w="100" w:type="dxa"/>
+              <w:right w:w="100" w:type="dxa"/>
+            </w:tcMar>
+          </w:tcPr>
+          <w:p>
+            <w:pPr>
+              <w:spacing w:line="276" w:lineRule="auto"/>
+            </w:pPr>
+            <w:r>
+              <w:rPr>
+                <w:sz w:val="18"/>
+              </w:rPr>
+              <w:t>System Setup &amp; Inventory Population</w:t>
+            </w:r>
+          </w:p>
+        </w:tc>
+        <w:tc>
+          <w:tcPr>
+            <w:tcW w:type="dxa" w:w="4896"/>
+            <w:shd w:fill="F8FAFC"/>
+            <w:tcMar>
+              <w:top w:w="100" w:type="dxa"/>
+              <w:bottom w:w="100" w:type="dxa"/>
+              <w:left w:w="100" w:type="dxa"/>
+              <w:right w:w="100" w:type="dxa"/>
+            </w:tcMar>
+          </w:tcPr>
+          <w:p>
+            <w:pPr>
+              <w:spacing w:line="276" w:lineRule="auto"/>
+            </w:pPr>
+            <w:r>
+              <w:rPr>
+                <w:sz w:val="18"/>
+              </w:rPr>
+              <w:t>Create user accounts (Admins, Managers, Sales Execs), configure branch offices, and upload master estates &amp; plot units.</w:t>
+            </w:r>
+          </w:p>
+        </w:tc>
+      </w:tr>
+      <w:tr>
+        <w:tc>
+          <w:tcPr>
+            <w:tcW w:type="dxa" w:w="1872"/>
+            <w:shd w:fill="F8FAFC"/>
+            <w:tcMar>
+              <w:top w:w="100" w:type="dxa"/>
+              <w:bottom w:w="100" w:type="dxa"/>
+              <w:left w:w="100" w:type="dxa"/>
+              <w:right w:w="100" w:type="dxa"/>
+            </w:tcMar>
+          </w:tcPr>
+          <w:p>
+            <w:pPr>
+              <w:spacing w:line="276" w:lineRule="auto"/>
+            </w:pPr>
+            <w:r>
+              <w:rPr>
+                <w:b/>
+                <w:color w:val="0F172A"/>
+                <w:sz w:val="18"/>
+              </w:rPr>
+              <w:t>Week 2 (Days 8–14)</w:t>
+            </w:r>
+          </w:p>
+        </w:tc>
+        <w:tc>
+          <w:tcPr>
+            <w:tcW w:type="dxa" w:w="3168"/>
+            <w:shd w:fill="FFFFFF"/>
+            <w:tcMar>
+              <w:top w:w="100" w:type="dxa"/>
+              <w:bottom w:w="100" w:type="dxa"/>
+              <w:left w:w="100" w:type="dxa"/>
+              <w:right w:w="100" w:type="dxa"/>
+            </w:tcMar>
+          </w:tcPr>
+          <w:p>
+            <w:pPr>
+              <w:spacing w:line="276" w:lineRule="auto"/>
+            </w:pPr>
+            <w:r>
+              <w:rPr>
+                <w:sz w:val="18"/>
+              </w:rPr>
+              <w:t>Sales Executive Field Training</w:t>
+            </w:r>
+          </w:p>
+        </w:tc>
+        <w:tc>
+          <w:tcPr>
+            <w:tcW w:type="dxa" w:w="4896"/>
+            <w:shd w:fill="F8FAFC"/>
+            <w:tcMar>
+              <w:top w:w="100" w:type="dxa"/>
+              <w:bottom w:w="100" w:type="dxa"/>
+              <w:left w:w="100" w:type="dxa"/>
+              <w:right w:w="100" w:type="dxa"/>
+            </w:tcMar>
+          </w:tcPr>
+          <w:p>
+            <w:pPr>
+              <w:spacing w:line="276" w:lineRule="auto"/>
+            </w:pPr>
+            <w:r>
+              <w:rPr>
+                <w:sz w:val="18"/>
+              </w:rPr>
+              <w:t>Hands-on staff workshop on lead entry, bulk CSV imports, Kanban pipeline management, and 1-tap WhatsApp portal sharing.</w:t>
+            </w:r>
+          </w:p>
+        </w:tc>
+      </w:tr>
+      <w:tr>
+        <w:tc>
+          <w:tcPr>
+            <w:tcW w:type="dxa" w:w="1872"/>
+            <w:shd w:fill="F8FAFC"/>
+            <w:tcMar>
+              <w:top w:w="100" w:type="dxa"/>
+              <w:bottom w:w="100" w:type="dxa"/>
+              <w:left w:w="100" w:type="dxa"/>
+              <w:right w:w="100" w:type="dxa"/>
+            </w:tcMar>
+          </w:tcPr>
+          <w:p>
+            <w:pPr>
+              <w:spacing w:line="276" w:lineRule="auto"/>
+            </w:pPr>
+            <w:r>
+              <w:rPr>
+                <w:b/>
+                <w:color w:val="0F172A"/>
+                <w:sz w:val="18"/>
+              </w:rPr>
+              <w:t>Week 3 (Days 15–21)</w:t>
+            </w:r>
+          </w:p>
+        </w:tc>
+        <w:tc>
+          <w:tcPr>
+            <w:tcW w:type="dxa" w:w="3168"/>
+            <w:shd w:fill="FFFFFF"/>
+            <w:tcMar>
+              <w:top w:w="100" w:type="dxa"/>
+              <w:bottom w:w="100" w:type="dxa"/>
+              <w:left w:w="100" w:type="dxa"/>
+              <w:right w:w="100" w:type="dxa"/>
+            </w:tcMar>
+          </w:tcPr>
+          <w:p>
+            <w:pPr>
+              <w:spacing w:line="276" w:lineRule="auto"/>
+            </w:pPr>
+            <w:r>
+              <w:rPr>
+                <w:sz w:val="18"/>
+              </w:rPr>
+              <w:t>Finance, Audit &amp; Legal Verification</w:t>
+            </w:r>
+          </w:p>
+        </w:tc>
+        <w:tc>
+          <w:tcPr>
+            <w:tcW w:type="dxa" w:w="4896"/>
+            <w:shd w:fill="F8FAFC"/>
+            <w:tcMar>
+              <w:top w:w="100" w:type="dxa"/>
+              <w:bottom w:w="100" w:type="dxa"/>
+              <w:left w:w="100" w:type="dxa"/>
+              <w:right w:w="100" w:type="dxa"/>
+            </w:tcMar>
+          </w:tcPr>
+          <w:p>
+            <w:pPr>
+              <w:spacing w:line="276" w:lineRule="auto"/>
+            </w:pPr>
+            <w:r>
+              <w:rPr>
+                <w:sz w:val="18"/>
+              </w:rPr>
+              <w:t>Finance team dry-run on recording part-payments, generating stamped PDF receipts, admin payment verification, and contract generation.</w:t>
+            </w:r>
+          </w:p>
+        </w:tc>
+      </w:tr>
+      <w:tr>
+        <w:tc>
+          <w:tcPr>
+            <w:tcW w:type="dxa" w:w="1872"/>
+            <w:shd w:fill="F8FAFC"/>
+            <w:tcMar>
+              <w:top w:w="100" w:type="dxa"/>
+              <w:bottom w:w="100" w:type="dxa"/>
+              <w:left w:w="100" w:type="dxa"/>
+              <w:right w:w="100" w:type="dxa"/>
+            </w:tcMar>
+          </w:tcPr>
+          <w:p>
+            <w:pPr>
+              <w:spacing w:line="276" w:lineRule="auto"/>
+            </w:pPr>
+            <w:r>
+              <w:rPr>
+                <w:b/>
+                <w:color w:val="0F172A"/>
+                <w:sz w:val="18"/>
+              </w:rPr>
+              <w:t>Week 4 (Days 22–30)</w:t>
+            </w:r>
+          </w:p>
+        </w:tc>
+        <w:tc>
+          <w:tcPr>
+            <w:tcW w:type="dxa" w:w="3168"/>
+            <w:shd w:fill="FFFFFF"/>
+            <w:tcMar>
+              <w:top w:w="100" w:type="dxa"/>
+              <w:bottom w:w="100" w:type="dxa"/>
+              <w:left w:w="100" w:type="dxa"/>
+              <w:right w:w="100" w:type="dxa"/>
+            </w:tcMar>
+          </w:tcPr>
+          <w:p>
+            <w:pPr>
+              <w:spacing w:line="276" w:lineRule="auto"/>
+            </w:pPr>
+            <w:r>
+              <w:rPr>
+                <w:sz w:val="18"/>
+              </w:rPr>
+              <w:t>Go-Live, Leaderboards &amp; First Payroll Run</w:t>
+            </w:r>
+          </w:p>
+        </w:tc>
+        <w:tc>
+          <w:tcPr>
+            <w:tcW w:type="dxa" w:w="4896"/>
+            <w:shd w:fill="F8FAFC"/>
+            <w:tcMar>
+              <w:top w:w="100" w:type="dxa"/>
+              <w:bottom w:w="100" w:type="dxa"/>
+              <w:left w:w="100" w:type="dxa"/>
+              <w:right w:w="100" w:type="dxa"/>
+            </w:tcMar>
+          </w:tcPr>
+          <w:p>
+            <w:pPr>
+              <w:spacing w:line="276" w:lineRule="auto"/>
+            </w:pPr>
+            <w:r>
+              <w:rPr>
+                <w:sz w:val="18"/>
+              </w:rPr>
+              <w:t>Full operational go-live across all branches, launching live leaderboard rankings, and executing the first automated monthly payroll.</w:t>
+            </w:r>
+          </w:p>
+        </w:tc>
+      </w:tr>
+    </w:tbl>
+    <w:p>
+      <w:pPr>
+        <w:spacing w:after="240"/>
+      </w:pPr>
+    </w:p>
+    <w:p>
+      <w:pPr>
+        <w:pStyle w:val="Heading1"/>
+      </w:pPr>
+      <w:r>
+        <w:rPr>
+          <w:color w:val="0F172A"/>
+        </w:rPr>
+        <w:t>10. Technical Support Hierarchy &amp; Service Level Agreement (SLA)</w:t>
+      </w:r>
+    </w:p>
+    <w:p>
+      <w:r>
+        <w:t>NAW World Technologies Limited provides multi-tiered technical support to ensure 99.9% uptime for RICAF Nigeria Limited:</w:t>
+      </w:r>
+    </w:p>
+    <w:p>
+      <w:pPr>
+        <w:spacing w:line="288" w:lineRule="auto" w:after="240"/>
+      </w:pPr>
+      <w:r>
+        <w:t>• Tier-1 (User Support &amp; Onboarding Guidance): Response within 2 hours. Guidance on feature navigation, password resets, and user roles.</w:t>
+        <w:br/>
+        <w:t>• Tier-2 (Application &amp; Workflow Configuration): Response within 4 hours. Template customizations, department target updates, and report exports.</w:t>
+        <w:br/>
+        <w:t>• Tier-3 (Critical Infrastructure &amp; Security Escalations): Immediate dispatch (under 30 minutes). Server performance, SSL certificate renewals, database failover, and SMTP routing.</w:t>
+        <w:br/>
+        <w:br/>
+        <w:t>Official Support Channels:</w:t>
+        <w:br/>
+        <w:t>📧 Enterprise Support Email: info@nawtechnologies.com</w:t>
+        <w:br/>
+        <w:t>🌐 Production Server Instance: https://crm.ricafltd.com</w:t>
+      </w:r>
+    </w:p>
+    <w:p>
+      <w:pPr>
+        <w:pStyle w:val="Heading1"/>
+      </w:pPr>
+      <w:r>
+        <w:rPr>
+          <w:color w:val="0F172A"/>
+        </w:rPr>
+        <w:t>11. Product Acceptance &amp; Formal Handover Sign-Off</w:t>
+      </w:r>
+    </w:p>
+    <w:p>
+      <w:r>
+        <w:t>This document certifies that the NAW Property Flow CRM application has been developed, configured, tested, and successfully deployed on the live production server (crm.ricafltd.com) according to the operational specifications of RICAF Nigeria Limited.</w:t>
+      </w:r>
+    </w:p>
+    <w:tbl>
+      <w:tblPr>
+        <w:tblW w:type="auto" w:w="0"/>
+        <w:jc w:val="center"/>
+        <w:tblLayout w:type="fixed"/>
+        <w:tblLook w:firstColumn="1" w:firstRow="1" w:lastColumn="0" w:lastRow="0" w:noHBand="0" w:noVBand="1" w:val="04A0"/>
+      </w:tblPr>
+      <w:tblGrid>
+        <w:gridCol w:w="4968"/>
+        <w:gridCol w:w="4968"/>
+      </w:tblGrid>
+      <w:tr>
+        <w:tc>
+          <w:tcPr>
+            <w:tcW w:type="dxa" w:w="4896"/>
+            <w:shd w:fill="1E293B"/>
+            <w:tcMar>
+              <w:top w:w="140" w:type="dxa"/>
+              <w:bottom w:w="140" w:type="dxa"/>
+              <w:left w:w="140" w:type="dxa"/>
+              <w:right w:w="140" w:type="dxa"/>
+            </w:tcMar>
+          </w:tcPr>
+          <w:p>
+            <w:r>
+              <w:rPr>
+                <w:b/>
+                <w:color w:val="FFFFFF"/>
+                <w:sz w:val="19"/>
+              </w:rPr>
+              <w:t>FOR: NAW WORLD TECHNOLOGIES LIMITED</w:t>
+              <w:br/>
+              <w:t>(Technology Provider &amp; System Architect)</w:t>
+            </w:r>
+          </w:p>
+        </w:tc>
+        <w:tc>
+          <w:tcPr>
+            <w:tcW w:type="dxa" w:w="4896"/>
+            <w:shd w:fill="1E293B"/>
+            <w:tcMar>
+              <w:top w:w="140" w:type="dxa"/>
+              <w:bottom w:w="140" w:type="dxa"/>
+              <w:left w:w="140" w:type="dxa"/>
+              <w:right w:w="140" w:type="dxa"/>
+            </w:tcMar>
+          </w:tcPr>
+          <w:p>
+            <w:r>
+              <w:rPr>
+                <w:b/>
+                <w:color w:val="FFFFFF"/>
+                <w:sz w:val="19"/>
+              </w:rPr>
+              <w:t>FOR: RICAF NIGERIA LIMITED</w:t>
+              <w:br/>
+              <w:t>(Client &amp; Operating Company)</w:t>
+            </w:r>
+          </w:p>
+        </w:tc>
+      </w:tr>
+      <w:tr>
+        <w:tc>
+          <w:tcPr>
+            <w:tcW w:type="dxa" w:w="4896"/>
+            <w:shd w:fill="FAFAFA"/>
+            <w:tcMar>
+              <w:top w:w="120" w:type="dxa"/>
+              <w:bottom w:w="120" w:type="dxa"/>
+              <w:left w:w="120" w:type="dxa"/>
+              <w:right w:w="120" w:type="dxa"/>
+            </w:tcMar>
+          </w:tcPr>
+          <w:p>
+            <w:pPr>
+              <w:spacing w:line="276" w:lineRule="auto"/>
+            </w:pPr>
+            <w:r>
+              <w:rPr>
+                <w:color w:val="0F172A"/>
+                <w:sz w:val="18"/>
+              </w:rPr>
+              <w:br/>
+              <w:t>Authorized Signatory: ___________________________</w:t>
+              <w:br/>
+              <w:br/>
+              <w:t>Name: Lead Software Architect &amp; Director</w:t>
+              <w:br/>
+              <w:br/>
+              <w:t>Designation: Enterprise Systems Division</w:t>
+              <w:br/>
+              <w:br/>
+              <w:t>Date: August 20, 2026</w:t>
+              <w:br/>
+              <w:br/>
+              <w:t>Official Seal / Stamp:</w:t>
+              <w:br/>
+              <w:br/>
+              <w:br/>
+            </w:r>
+          </w:p>
+        </w:tc>
+        <w:tc>
+          <w:tcPr>
+            <w:tcW w:type="dxa" w:w="4896"/>
+            <w:shd w:fill="FAFAFA"/>
+            <w:tcMar>
+              <w:top w:w="120" w:type="dxa"/>
+              <w:bottom w:w="120" w:type="dxa"/>
+              <w:left w:w="120" w:type="dxa"/>
+              <w:right w:w="120" w:type="dxa"/>
+            </w:tcMar>
+          </w:tcPr>
+          <w:p>
+            <w:pPr>
+              <w:spacing w:line="276" w:lineRule="auto"/>
+            </w:pPr>
+            <w:r>
+              <w:rPr>
+                <w:color w:val="0F172A"/>
+                <w:sz w:val="18"/>
+              </w:rPr>
+              <w:br/>
+              <w:t>Authorized Signatory: ___________________________</w:t>
+              <w:br/>
+              <w:br/>
+              <w:t>Name: Managing Director / COO</w:t>
+              <w:br/>
+              <w:br/>
+              <w:t>Designation: Executive Management</w:t>
+              <w:br/>
+              <w:br/>
+              <w:t>Date: _________________________</w:t>
+              <w:br/>
+              <w:br/>
+              <w:t>Official Seal / Stamp:</w:t>
+              <w:br/>
+              <w:br/>
+              <w:br/>
+            </w:r>
+          </w:p>
+        </w:tc>
+      </w:tr>
+    </w:tbl>
+    <w:p>
+      <w:pPr>
+        <w:spacing w:after="240"/>
+      </w:pPr>
     </w:p>
     <w:tbl>
       <w:tblPr>
@@ -1123,7 +2470,7 @@
               </w:rPr>
               <w:t>DOCUMENT PREPARED BY NAW WORLD TECHNOLOGIES LIMITED • NAW PROPERTY FLOW CRM DIVISION</w:t>
               <w:br/>
-              <w:t>Client Support &amp; Deployments: info@nawtechnologies.com • Live Server: crm.ricafltd.com</w:t>
+              <w:t>Client Support &amp; Deployments: info@nawtechnologies.com • Live Server Instance: crm.ricafltd.com</w:t>
             </w:r>
           </w:p>
         </w:tc>

</xml_diff>

<commit_message>
Update Product Guide (.docx) to explicitly detail Dynamic Multi-Department Management & Custom KPI Governance for Media, Admin, and other operational units
</commit_message>
<xml_diff>
--- a/NAW_Property_Flow_CRM_RICAF_Product_Guide.docx
+++ b/NAW_Property_Flow_CRM_RICAF_Product_Guide.docx
@@ -1478,7 +1478,33 @@
           <w:color w:val="FEA500"/>
           <w:sz w:val="23"/>
         </w:rPr>
-        <w:t>10. HR Management, Sales Leaderboard &amp; 1-Click Automated Payroll</w:t>
+        <w:t>10. Dynamic Multi-Department Management &amp; Custom KPI Governance (Zero-Code Scalability)</w:t>
+      </w:r>
+    </w:p>
+    <w:p>
+      <w:pPr>
+        <w:spacing w:line="288" w:lineRule="auto" w:after="160"/>
+      </w:pPr>
+      <w:r>
+        <w:t>• Infinite Organizational Scalability: Create and manage unlimited operational departments (e.g. Media &amp; Creative, Administration, Legal &amp; Land Titles, Customer Relations, Logistics, Security) without writing new code.</w:t>
+        <w:br/>
+        <w:t>• Custom KPI &amp; Metric Configurator: Define unique performance metrics for each department (e.g., 'Site Videos Shot', 'Engagement Numbers', 'Deed of Assignment Drafted', 'Office Maintenance Turnaround %').</w:t>
+        <w:br/>
+        <w:t>• Hierarchical Staff Submissions: Staff submit daily/weekly performance logs against their departmental metrics and attach supporting files.</w:t>
+        <w:br/>
+        <w:t>• HOD Approval &amp; MD Scorecards: Head of Departments review and approve submissions, which instantly feed into the Executive Consolidated Department Performance Report.</w:t>
+      </w:r>
+    </w:p>
+    <w:p>
+      <w:pPr>
+        <w:pStyle w:val="Heading2"/>
+      </w:pPr>
+      <w:r>
+        <w:rPr>
+          <w:color w:val="FEA500"/>
+          <w:sz w:val="23"/>
+        </w:rPr>
+        <w:t>11. HR Governance, Sales Leaderboard &amp; 1-Click Automated Payroll</w:t>
       </w:r>
     </w:p>
     <w:p>
@@ -1492,7 +1518,7 @@
         <w:br/>
         <w:t>• 1-Click Automated Monthly Payroll: Automatically aggregates base staff salaries + all approved monthly marketer commissions into consolidated payslips ready for bank export.</w:t>
         <w:br/>
-        <w:t>• Staff Governance: Employee leave applications, staff submissions/reports, onboarding checklists, and disciplinary/review logs.</w:t>
+        <w:t>• Staff Governance: Employee leave applications, staff onboarding checklists, and disciplinary/review logs.</w:t>
       </w:r>
     </w:p>
     <w:p>
@@ -1504,7 +1530,7 @@
           <w:color w:val="FEA500"/>
           <w:sz w:val="23"/>
         </w:rPr>
-        <w:t>11. Cloud File Storage &amp; Digital Asset Vault</w:t>
+        <w:t>12. Cloud File Storage &amp; Digital Asset Vault</w:t>
       </w:r>
     </w:p>
     <w:p>
@@ -1526,7 +1552,7 @@
           <w:color w:val="FEA500"/>
           <w:sz w:val="23"/>
         </w:rPr>
-        <w:t>12. Virtual 3D Tour Integration (Prototype)</w:t>
+        <w:t>13. Virtual 3D Tour Integration (Prototype)</w:t>
       </w:r>
     </w:p>
     <w:p>
@@ -1546,7 +1572,7 @@
           <w:color w:val="FEA500"/>
           <w:sz w:val="23"/>
         </w:rPr>
-        <w:t>13. Multi-Branch Operations &amp; Consolidated Reporting</w:t>
+        <w:t>14. Multi-Branch Operations &amp; Consolidated Reporting</w:t>
       </w:r>
     </w:p>
     <w:p>

</xml_diff>